<commit_message>
docs(artigo+apresentacao): Seções 5.4/5.5 (B1.4, pivô difusão) + fix do gerador Word
- artigo_resultados.md: novas seções 5.4 (B1.4 — mapeamento real de subsítios,
  18/18 GO) e 5.5 (pivô para geração por difusão, campanha real em andamento);
  Tabela 10 ganhou legenda pra renderizar como tabela real no Word.
- gerar_artigo_word.py: corrige slice hardcoded [19:1206] que cortava a Seção
  5 inteira fora do docx desde que foi criada (17-18/09) — nunca tinha sido
  incluída no Word até agora. Agora acha "## Referências" dinamicamente.
- apresentacao_design_inibidores.pptx: 3 slides novos (23-25) acrescentados
  via scripts/append_update_slides.py, que abre o .pptx existente e só
  adiciona ao final — não regenera do zero via gerar_apresentacao_pptx.py
  (que reconstruiria as 22 slides originais a partir de canva_slides_data.json
  e apagaria uma edição manual pendente desde 2026-07-21, nunca commitada).

Co-Authored-By: Claude Sonnet 5 <noreply@anthropic.com>
</commit_message>
<xml_diff>
--- a/artigo_design_inibidores.docx
+++ b/artigo_design_inibidores.docx
@@ -2640,6 +2640,470 @@
       <w:r>
         <w:rPr/>
         <w:t>) em vez da estrutura já equilibrada, ponto de partida menos ideal que o dos outros 12 candidatos (ainda assim dado real de simulação completa, não fabricado — ressalva registrada na Tabela 9n).</w:t>
+      </w:r>
+    </w:p>
+    <w:p>
+      <w:pPr>
+        <w:pStyle w:val="Heading1"/>
+      </w:pPr>
+      <w:r>
+        <w:t>2.13 Replanejamento V2 — Painel de Calibração e Verificação de Especificidade (2026-09-18)</w:t>
+      </w:r>
+    </w:p>
+    <w:p>
+      <w:r>
+        <w:rPr/>
+        <w:t>O resultado negativo consolidado do V1 (Seção 2.12/Resultados Seção 4) motivou substituir o critério de scoring por uma escada calibrada contra controles reais antes de qualquer nova campanha de design (</w:t>
+      </w:r>
+      <w:r>
+        <w:rPr>
+          <w:rFonts w:ascii="Consolas" w:hAnsi="Consolas"/>
+        </w:rPr>
+        <w:t>docs/PLANO_V2_GENERATIVO.md</w:t>
+      </w:r>
+      <w:r>
+        <w:rPr/>
+        <w:t>, Bloco B0.5 — "sem ele nenhuma métrica de scoring usada depois é confiável").</w:t>
+      </w:r>
+    </w:p>
+    <w:p>
+      <w:r>
+        <w:rPr>
+          <w:b/>
+        </w:rPr>
+        <w:t>Curadoria do painel de tripsinas-alvo.</w:t>
+      </w:r>
+      <w:r>
+        <w:rPr/>
+        <w:t xml:space="preserve"> Busca UniProt REST (</w:t>
+      </w:r>
+      <w:r>
+        <w:rPr>
+          <w:rFonts w:ascii="Consolas" w:hAnsi="Consolas"/>
+        </w:rPr>
+        <w:t>reviewed:true</w:t>
+      </w:r>
+      <w:r>
+        <w:rPr/>
+        <w:t xml:space="preserve"> + </w:t>
+      </w:r>
+      <w:r>
+        <w:rPr>
+          <w:rFonts w:ascii="Consolas" w:hAnsi="Consolas"/>
+        </w:rPr>
+        <w:t>keyword:KW-0224</w:t>
+      </w:r>
+      <w:r>
+        <w:rPr/>
+        <w:t xml:space="preserve">) nas 9 espécies de Lepidoptera do plano mostrou cobertura curada quase nula fora de </w:t>
+      </w:r>
+      <w:r>
+        <w:rPr>
+          <w:i/>
+        </w:rPr>
+        <w:t>Manduca sexta</w:t>
+      </w:r>
+      <w:r>
+        <w:rPr/>
+        <w:t xml:space="preserve"> (única com </w:t>
+      </w:r>
+      <w:r>
+        <w:rPr>
+          <w:rFonts w:ascii="Consolas" w:hAnsi="Consolas"/>
+        </w:rPr>
+        <w:t>cc_tissue_specificity=Midgut</w:t>
+      </w:r>
+      <w:r>
+        <w:rPr/>
+        <w:t xml:space="preserve"> real). Diante disso, adotou-se heurística de homologia + estrutura modelada (decisão do usuário): reaproveitamento de 10 estruturas AlphaFoldDB de sessão anterior, com </w:t>
+      </w:r>
+      <w:r>
+        <w:rPr>
+          <w:b/>
+        </w:rPr>
+        <w:t>verificação de especificidade tipo-tripsina por resíduo Asp189-equivalente</w:t>
+      </w:r>
+      <w:r>
+        <w:rPr/>
+        <w:t xml:space="preserve"> — offset de 6 resíduos N-terminais ao Ser catalítico, calibrado contra tripsina bovina real (UniProt P00760, feature </w:t>
+      </w:r>
+      <w:r>
+        <w:rPr>
+          <w:rFonts w:ascii="Consolas" w:hAnsi="Consolas"/>
+        </w:rPr>
+        <w:t>Active site</w:t>
+      </w:r>
+      <w:r>
+        <w:rPr/>
+        <w:t xml:space="preserve"> em Ser200/precursor; resíduo em </w:t>
+      </w:r>
+      <w:r>
+        <w:rPr>
+          <w:rFonts w:ascii="Consolas" w:hAnsi="Consolas"/>
+        </w:rPr>
+        <w:t>200−6=194</w:t>
+      </w:r>
+      <w:r>
+        <w:rPr/>
+        <w:t xml:space="preserve"> = Asp confirmado) e quimotripsina bovina real (P00766, Ser195/precursor; resíduo em </w:t>
+      </w:r>
+      <w:r>
+        <w:rPr>
+          <w:rFonts w:ascii="Consolas" w:hAnsi="Consolas"/>
+        </w:rPr>
+        <w:t>195−6=189</w:t>
+      </w:r>
+      <w:r>
+        <w:rPr/>
+        <w:t xml:space="preserve"> = Ser confirmado), aplicado então às 9 sequências do painel via busca direta do motivo conservado </w:t>
+      </w:r>
+      <w:r>
+        <w:rPr>
+          <w:rFonts w:ascii="Consolas" w:hAnsi="Consolas"/>
+        </w:rPr>
+        <w:t>G[DN]SGG[PT]</w:t>
+      </w:r>
+      <w:r>
+        <w:rPr/>
+        <w:t xml:space="preserve"> (Ser catalítico) em cada sequência.</w:t>
+      </w:r>
+    </w:p>
+    <w:p>
+      <w:r>
+        <w:rPr>
+          <w:b/>
+        </w:rPr>
+        <w:t>Painel de calibração (controles reais + decoys).</w:t>
+      </w:r>
+      <w:r>
+        <w:rPr/>
+        <w:t xml:space="preserve"> Seis inibidores de tripsina com estrutura e/ou caracterização publicada: BPTI (PDB 1BPI), SFTI-1 (PDB 1SFI — complexo real com tripsina bovina, usado também como fonte do centro real do sítio ativo), SKTI (PDB 1AVU), Bowman-Birk (PDB 1BBI), EcTI (PDB 4J2K, cadeia única — a estrutura depositada tem 2 cópias cristalográficas do monômero sob as mesmas etiquetas de cadeia A/B, corrigido para usar só uma cópia) e ApTI (P09941+P09942, sem estrutura experimental depositada, modelado nesta sessão). Cinco decoys (mesma composição de aminoácidos dos 5 primeiros controles, ordem embaralhada por </w:t>
+      </w:r>
+      <w:r>
+        <w:rPr>
+          <w:rFonts w:ascii="Consolas" w:hAnsi="Consolas"/>
+        </w:rPr>
+        <w:t>random.seed(42)</w:t>
+      </w:r>
+      <w:r>
+        <w:rPr/>
+        <w:t>) serviram de controle negativo.</w:t>
+      </w:r>
+    </w:p>
+    <w:p>
+      <w:r>
+        <w:rPr>
+          <w:b/>
+        </w:rPr>
+        <w:t>Docking rígido — Vina substituído por HADDOCK3 após incidente de memória.</w:t>
+      </w:r>
+      <w:r>
+        <w:rPr/>
+        <w:t xml:space="preserve"> A tentativa de reusar AutoDock Vina (protocolo idêntico ao da Seção 2.7, ligante rígido </w:t>
+      </w:r>
+      <w:r>
+        <w:rPr>
+          <w:rFonts w:ascii="Consolas" w:hAnsi="Consolas"/>
+        </w:rPr>
+        <w:t>TORSDOF=0</w:t>
+      </w:r>
+      <w:r>
+        <w:rPr/>
+        <w:t xml:space="preserve">) para os controles de calibração — proteínas dobradas inteiras de 58–172 resíduos, ordens de grandeza maiores que os peptídeos de 5–20 aa do V1 — resultou em consumo de 97 GB de RAM (processo terminado por segurança antes de causar OOM no servidor de 188 GB). Diagnosticado como limitação de escala do build de Vina para ligantes desse tamanho, não bug de configuração (um controle de 14 aa, SFTI-1, rodou normalmente). Substituído por </w:t>
+      </w:r>
+      <w:r>
+        <w:rPr>
+          <w:b/>
+        </w:rPr>
+        <w:t>HADDOCK3 v2026.7.0</w:t>
+      </w:r>
+      <w:r>
+        <w:rPr/>
+        <w:t xml:space="preserve"> (</w:t>
+      </w:r>
+      <w:r>
+        <w:rPr>
+          <w:rFonts w:ascii="Consolas" w:hAnsi="Consolas"/>
+        </w:rPr>
+        <w:t>haddock3-restraints active_passive_to_ambig</w:t>
+      </w:r>
+      <w:r>
+        <w:rPr/>
+        <w:t xml:space="preserve">, </w:t>
+      </w:r>
+      <w:r>
+        <w:rPr>
+          <w:rFonts w:ascii="Consolas" w:hAnsi="Consolas"/>
+        </w:rPr>
+        <w:t>[topoaa]</w:t>
+      </w:r>
+      <w:r>
+        <w:rPr/>
+        <w:t>+</w:t>
+      </w:r>
+      <w:r>
+        <w:rPr>
+          <w:rFonts w:ascii="Consolas" w:hAnsi="Consolas"/>
+        </w:rPr>
+        <w:t>[rigidbody]</w:t>
+      </w:r>
+      <w:r>
+        <w:rPr/>
+        <w:t xml:space="preserve">, </w:t>
+      </w:r>
+      <w:r>
+        <w:rPr>
+          <w:rFonts w:ascii="Consolas" w:hAnsi="Consolas"/>
+        </w:rPr>
+        <w:t>sampling=48</w:t>
+      </w:r>
+      <w:r>
+        <w:rPr/>
+        <w:t xml:space="preserve">), apropriado para docking proteína-proteína. Resíduos ativos de interface identificados por </w:t>
+      </w:r>
+      <w:r>
+        <w:rPr>
+          <w:b/>
+        </w:rPr>
+        <w:t>contato direto (&lt;6 Å) ao Ser catalítico em complexos experimentais reais</w:t>
+      </w:r>
+      <w:r>
+        <w:rPr/>
+        <w:t xml:space="preserve"> baixados do RCSB (1SFI, 1AVX, 1D6R, 4J2Y) — não citações de literatura não conferidas nesta sessão.</w:t>
+      </w:r>
+    </w:p>
+    <w:p>
+      <w:r>
+        <w:rPr>
+          <w:b/>
+        </w:rPr>
+        <w:t>Co-dobramento — Boltz-2.</w:t>
+      </w:r>
+      <w:r>
+        <w:rPr/>
+        <w:t xml:space="preserve"> </w:t>
+      </w:r>
+      <w:r>
+        <w:rPr>
+          <w:rFonts w:ascii="Consolas" w:hAnsi="Consolas"/>
+        </w:rPr>
+        <w:t>boltz predict</w:t>
+      </w:r>
+      <w:r>
+        <w:rPr/>
+        <w:t xml:space="preserve"> (checkpoint </w:t>
+      </w:r>
+      <w:r>
+        <w:rPr>
+          <w:rFonts w:ascii="Consolas" w:hAnsi="Consolas"/>
+        </w:rPr>
+        <w:t>boltz2_conf.ckpt</w:t>
+      </w:r>
+      <w:r>
+        <w:rPr/>
+        <w:t xml:space="preserve">, </w:t>
+      </w:r>
+      <w:r>
+        <w:rPr>
+          <w:rFonts w:ascii="Consolas" w:hAnsi="Consolas"/>
+        </w:rPr>
+        <w:t>--use_msa_server</w:t>
+      </w:r>
+      <w:r>
+        <w:rPr/>
+        <w:t xml:space="preserve">, </w:t>
+      </w:r>
+      <w:r>
+        <w:rPr>
+          <w:rFonts w:ascii="Consolas" w:hAnsi="Consolas"/>
+        </w:rPr>
+        <w:t>--diffusion_samples 1</w:t>
+      </w:r>
+      <w:r>
+        <w:rPr/>
+        <w:t xml:space="preserve">, </w:t>
+      </w:r>
+      <w:r>
+        <w:rPr>
+          <w:rFonts w:ascii="Consolas" w:hAnsi="Consolas"/>
+        </w:rPr>
+        <w:t>--recycling_steps 3</w:t>
+      </w:r>
+      <w:r>
+        <w:rPr/>
+        <w:t>) para os 22 pares ligante-receptor (6 controles + 5 decoys pareados × 2 receptores + 2 ApTI), sem restrição de interface (co-dobramento nativo a partir só da sequência). MSA real via servidor público MMseqs2 (~50s/predição). Métricas de confiança nativas do Boltz-2 (</w:t>
+      </w:r>
+      <w:r>
+        <w:rPr>
+          <w:rFonts w:ascii="Consolas" w:hAnsi="Consolas"/>
+        </w:rPr>
+        <w:t>confidence_score</w:t>
+      </w:r>
+      <w:r>
+        <w:rPr/>
+        <w:t xml:space="preserve">, </w:t>
+      </w:r>
+      <w:r>
+        <w:rPr>
+          <w:rFonts w:ascii="Consolas" w:hAnsi="Consolas"/>
+        </w:rPr>
+        <w:t>iptm</w:t>
+      </w:r>
+      <w:r>
+        <w:rPr/>
+        <w:t xml:space="preserve">, </w:t>
+      </w:r>
+      <w:r>
+        <w:rPr>
+          <w:rFonts w:ascii="Consolas" w:hAnsi="Consolas"/>
+        </w:rPr>
+        <w:t>complex_plddt</w:t>
+      </w:r>
+      <w:r>
+        <w:rPr/>
+        <w:t>) usadas como critério de separação real/decoy.</w:t>
+      </w:r>
+    </w:p>
+    <w:p>
+      <w:r>
+        <w:rPr>
+          <w:b/>
+        </w:rPr>
+        <w:t>MD curta.</w:t>
+      </w:r>
+      <w:r>
+        <w:rPr/>
+        <w:t xml:space="preserve"> Reaproveitamento direto de </w:t>
+      </w:r>
+      <w:r>
+        <w:rPr>
+          <w:rFonts w:ascii="Consolas" w:hAnsi="Consolas"/>
+        </w:rPr>
+        <w:t>MDAgent._run_gromacs()</w:t>
+      </w:r>
+      <w:r>
+        <w:rPr/>
+        <w:t xml:space="preserve"> (idêntico à Seção 2.8/2.12), partindo dos complexos preditos pelo Boltz-2 (</w:t>
+      </w:r>
+      <w:r>
+        <w:rPr>
+          <w:rFonts w:ascii="Consolas" w:hAnsi="Consolas"/>
+        </w:rPr>
+        <w:t>*_model_0.pdb</w:t>
+      </w:r>
+      <w:r>
+        <w:rPr/>
+        <w:t xml:space="preserve">) em vez de estruturas construídas por </w:t>
+      </w:r>
+      <w:r>
+        <w:rPr>
+          <w:rFonts w:ascii="Consolas" w:hAnsi="Consolas"/>
+        </w:rPr>
+        <w:t>PeptideBuilder</w:t>
+      </w:r>
+      <w:r>
+        <w:rPr/>
+        <w:t xml:space="preserve">. Protonação real por </w:t>
+      </w:r>
+      <w:r>
+        <w:rPr>
+          <w:rFonts w:ascii="Consolas" w:hAnsi="Consolas"/>
+        </w:rPr>
+        <w:t>pdb2pqr30</w:t>
+      </w:r>
+      <w:r>
+        <w:rPr/>
+        <w:t xml:space="preserve">/propka com </w:t>
+      </w:r>
+      <w:r>
+        <w:rPr>
+          <w:b/>
+        </w:rPr>
+        <w:t>pH diferenciado por receptor</w:t>
+      </w:r>
+      <w:r>
+        <w:rPr/>
+        <w:t xml:space="preserve">: 8,0 para tripsina bovina (fisiológico de mamífero) vs. 10,0 para </w:t>
+      </w:r>
+      <w:r>
+        <w:rPr>
+          <w:i/>
+        </w:rPr>
+        <w:t>S. frugiperda</w:t>
+      </w:r>
+      <w:r>
+        <w:rPr/>
+        <w:t xml:space="preserve"> (intestino alcalino real de Lepidoptera, já usado nas Seções 2.11/2.12 para os receptores nativos). Produção de 2 ns por sistema (mais curta que os 10 ns da Seção 2.8/2.12, adequada à finalidade de calibração/triagem, não de produção final). Achado de engenharia: o ambiente conda </w:t>
+      </w:r>
+      <w:r>
+        <w:rPr>
+          <w:rFonts w:ascii="Consolas" w:hAnsi="Consolas"/>
+        </w:rPr>
+        <w:t>md-gromacs</w:t>
+      </w:r>
+      <w:r>
+        <w:rPr/>
+        <w:t xml:space="preserve"> tem uma instalação de </w:t>
+      </w:r>
+      <w:r>
+        <w:rPr>
+          <w:rFonts w:ascii="Consolas" w:hAnsi="Consolas"/>
+        </w:rPr>
+        <w:t>pandas</w:t>
+      </w:r>
+      <w:r>
+        <w:rPr/>
+        <w:t xml:space="preserve"> quebrada que impede importar o pacote </w:t>
+      </w:r>
+      <w:r>
+        <w:rPr>
+          <w:rFonts w:ascii="Consolas" w:hAnsi="Consolas"/>
+        </w:rPr>
+        <w:t>scripts.agents</w:t>
+      </w:r>
+      <w:r>
+        <w:rPr/>
+        <w:t xml:space="preserve"> completo (necessário para </w:t>
+      </w:r>
+      <w:r>
+        <w:rPr>
+          <w:rFonts w:ascii="Consolas" w:hAnsi="Consolas"/>
+        </w:rPr>
+        <w:t>MDAgent</w:t>
+      </w:r>
+      <w:r>
+        <w:rPr/>
+        <w:t xml:space="preserve">) — contornado executando o orquestrador Python em </w:t>
+      </w:r>
+      <w:r>
+        <w:rPr>
+          <w:rFonts w:ascii="Consolas" w:hAnsi="Consolas"/>
+        </w:rPr>
+        <w:t>protein_design_env</w:t>
+      </w:r>
+      <w:r>
+        <w:rPr/>
+        <w:t xml:space="preserve"> (pandas funcional), já que </w:t>
+      </w:r>
+      <w:r>
+        <w:rPr>
+          <w:rFonts w:ascii="Consolas" w:hAnsi="Consolas"/>
+        </w:rPr>
+        <w:t>MDAgent._find_gmx()</w:t>
+      </w:r>
+      <w:r>
+        <w:rPr/>
+        <w:t xml:space="preserve"> localiza o binário </w:t>
+      </w:r>
+      <w:r>
+        <w:rPr>
+          <w:rFonts w:ascii="Consolas" w:hAnsi="Consolas"/>
+        </w:rPr>
+        <w:t>gmx_mpi</w:t>
+      </w:r>
+      <w:r>
+        <w:rPr/>
+        <w:t xml:space="preserve"> por caminho absoluto, independente do ambiente conda ativo do processo Python.</w:t>
       </w:r>
     </w:p>
     <w:p>
@@ -27467,6 +27931,969 @@
       <w:r>
         <w:rPr/>
         <w:t xml:space="preserve"> | Média |</w:t>
+      </w:r>
+    </w:p>
+    <w:p>
+      <w:pPr>
+        <w:pStyle w:val="Heading1"/>
+      </w:pPr>
+      <w:r>
+        <w:t>5. Replanejamento V2 — Contrasseleção e Calibração da Escada de Scoring (2026-09-17/18)</w:t>
+      </w:r>
+    </w:p>
+    <w:p>
+      <w:r>
+        <w:rPr/>
+        <w:t>O resultado negativo consolidado na Seção 4 (0/21-23 candidatos com margem de seletividade real, Seção 3.11) motivou um replanejamento completo do projeto (</w:t>
+      </w:r>
+      <w:r>
+        <w:rPr>
+          <w:rFonts w:ascii="Consolas" w:hAnsi="Consolas"/>
+        </w:rPr>
+        <w:t>docs/PLANO_V2_GENERATIVO.md</w:t>
+      </w:r>
+      <w:r>
+        <w:rPr/>
+        <w:t xml:space="preserve">, commit </w:t>
+      </w:r>
+      <w:r>
+        <w:rPr>
+          <w:rFonts w:ascii="Consolas" w:hAnsi="Consolas"/>
+        </w:rPr>
+        <w:t>3a8add2</w:t>
+      </w:r>
+      <w:r>
+        <w:rPr/>
+        <w:t>): a causa do fracasso do V1 foi julgada estrutural — o sítio S1 de tripsina é conservado entre lagarta/humano/abelha, e o Vina rígido nunca havia sido calibrado contra inibidores conhecidos antes de ser usado como fonte de verdade. O V2 recentraliza o projeto em torno de dois pilares ainda não executados no V1: contrasseleção como objetivo de geração (não checagem pós-hoc) e calibração explícita da escada de scoring contra controles reais — Bloco B0.5 do plano, relatado nesta seção.</w:t>
+      </w:r>
+    </w:p>
+    <w:p>
+      <w:pPr>
+        <w:pStyle w:val="Heading2"/>
+      </w:pPr>
+      <w:r>
+        <w:t>5.1 Painel de tripsinas-alvo de Lepidoptera por heurística de homologia</w:t>
+      </w:r>
+    </w:p>
+    <w:p>
+      <w:r>
+        <w:rPr/>
+        <w:t xml:space="preserve">Busca sistemática no UniProt (reviewed + anotação funcional </w:t>
+      </w:r>
+      <w:r>
+        <w:rPr>
+          <w:rFonts w:ascii="Consolas" w:hAnsi="Consolas"/>
+        </w:rPr>
+        <w:t>keyword:KW-0224</w:t>
+      </w:r>
+      <w:r>
+        <w:rPr/>
+        <w:t xml:space="preserve">) mostrou que, das 9 espécies-alvo do plano, </w:t>
+      </w:r>
+      <w:r>
+        <w:rPr>
+          <w:b/>
+        </w:rPr>
+        <w:t xml:space="preserve">apenas </w:t>
+      </w:r>
+      <w:r>
+        <w:rPr>
+          <w:b/>
+          <w:i/>
+        </w:rPr>
+        <w:t>Manduca sexta</w:t>
+      </w:r>
+      <w:r>
+        <w:rPr>
+          <w:b/>
+        </w:rPr>
+        <w:t xml:space="preserve"> tem tripsinas digestivas curadas com evidência experimental de expressão em midgut</w:t>
+      </w:r>
+      <w:r>
+        <w:rPr/>
+        <w:t xml:space="preserve"> (P35045/P35046/P35047, </w:t>
+      </w:r>
+      <w:r>
+        <w:rPr>
+          <w:rFonts w:ascii="Consolas" w:hAnsi="Consolas"/>
+        </w:rPr>
+        <w:t>cc_tissue_specificity = Midgut</w:t>
+      </w:r>
+      <w:r>
+        <w:rPr/>
+        <w:t xml:space="preserve">). As demais espécies — incluindo </w:t>
+      </w:r>
+      <w:r>
+        <w:rPr>
+          <w:i/>
+        </w:rPr>
+        <w:t>Spodoptera frugiperda</w:t>
+      </w:r>
+      <w:r>
+        <w:rPr/>
+        <w:t>, alvo principal do projeto — não têm nenhuma entrada revisada no UniProt para tripsina digestiva, apenas anotação automática (TrEMBL) sem evidência tecidual curada.</w:t>
+      </w:r>
+    </w:p>
+    <w:p>
+      <w:r>
+        <w:rPr/>
+        <w:t xml:space="preserve">Diante disso, foi adotada uma heurística de homologia + estrutura modelada (decisão do usuário, 2026-09-18): reaproveitaram-se 10 estruturas AlphaFoldDB já obtidas em sessão anterior (2026-07-18) para </w:t>
+      </w:r>
+      <w:r>
+        <w:rPr>
+          <w:i/>
+        </w:rPr>
+        <w:t>S. frugiperda</w:t>
+      </w:r>
+      <w:r>
+        <w:rPr/>
+        <w:t xml:space="preserve">, </w:t>
+      </w:r>
+      <w:r>
+        <w:rPr>
+          <w:i/>
+        </w:rPr>
+        <w:t>S. litura</w:t>
+      </w:r>
+      <w:r>
+        <w:rPr/>
+        <w:t xml:space="preserve">, </w:t>
+      </w:r>
+      <w:r>
+        <w:rPr>
+          <w:i/>
+        </w:rPr>
+        <w:t>Ostrinia nubilalis</w:t>
+      </w:r>
+      <w:r>
+        <w:rPr/>
+        <w:t xml:space="preserve">, </w:t>
+      </w:r>
+      <w:r>
+        <w:rPr>
+          <w:i/>
+        </w:rPr>
+        <w:t>Diatraea saccharalis</w:t>
+      </w:r>
+      <w:r>
+        <w:rPr/>
+        <w:t xml:space="preserve">, </w:t>
+      </w:r>
+      <w:r>
+        <w:rPr>
+          <w:i/>
+        </w:rPr>
+        <w:t>Heliothis virescens</w:t>
+      </w:r>
+      <w:r>
+        <w:rPr/>
+        <w:t xml:space="preserve">, </w:t>
+      </w:r>
+      <w:r>
+        <w:rPr>
+          <w:i/>
+        </w:rPr>
+        <w:t>Plutella xylostella</w:t>
+      </w:r>
+      <w:r>
+        <w:rPr/>
+        <w:t xml:space="preserve">, </w:t>
+      </w:r>
+      <w:r>
+        <w:rPr>
+          <w:i/>
+        </w:rPr>
+        <w:t>Chrysodeixis includens</w:t>
+      </w:r>
+      <w:r>
+        <w:rPr/>
+        <w:t xml:space="preserve">, </w:t>
+      </w:r>
+      <w:r>
+        <w:rPr>
+          <w:i/>
+        </w:rPr>
+        <w:t>Bombyx mori</w:t>
+      </w:r>
+      <w:r>
+        <w:rPr/>
+        <w:t xml:space="preserve"> e </w:t>
+      </w:r>
+      <w:r>
+        <w:rPr>
+          <w:i/>
+        </w:rPr>
+        <w:t>M. sexta</w:t>
+      </w:r>
+      <w:r>
+        <w:rPr/>
+        <w:t xml:space="preserve">. A especificidade de substrato tipo-tripsina (não quimotripsina, apesar do nome automático "Chymotrypsin" atribuído pelo UniProt à maioria das entradas) foi </w:t>
+      </w:r>
+      <w:r>
+        <w:rPr>
+          <w:b/>
+        </w:rPr>
+        <w:t>confirmada por verificação direta do resíduo de especificidade clássico (Asp189-equivalente)</w:t>
+      </w:r>
+      <w:r>
+        <w:rPr/>
+        <w:t xml:space="preserve">: o offset de 6 resíduos N-terminais ao Ser catalítico foi validado contra tripsina bovina real (P00760, Asp194=Asp) e quimotripsina bovina real (P00766, Ser189=Ser), e então aplicado às 9 sequências do painel — </w:t>
+      </w:r>
+      <w:r>
+        <w:rPr>
+          <w:b/>
+        </w:rPr>
+        <w:t>todas apresentam Asp nessa posição</w:t>
+      </w:r>
+      <w:r>
+        <w:rPr/>
+        <w:t xml:space="preserve">, confirmando especificidade tripsina real em 100% do painel. </w:t>
+      </w:r>
+      <w:r>
+        <w:rPr>
+          <w:i/>
+        </w:rPr>
+        <w:t>Bombyx mori</w:t>
+      </w:r>
+      <w:r>
+        <w:rPr/>
+        <w:t xml:space="preserve"> foi realocada do painel de alvos para o painel negativo de contrasseleção (B1.2), por ser inseto benéfico de valor econômico (sericicultura), não praga — decisão de escopo, não de especificidade molecular (também apresenta Asp na posição de especificidade).</w:t>
+      </w:r>
+    </w:p>
+    <w:p>
+      <w:pPr>
+        <w:pStyle w:val="Heading2"/>
+      </w:pPr>
+      <w:r>
+        <w:t>5.2 Calibração da escada de scoring (B0.5) — controles reais vs. decoys</w:t>
+      </w:r>
+    </w:p>
+    <w:p>
+      <w:r>
+        <w:rPr/>
+        <w:t xml:space="preserve">Seis inibidores de tripsina bem caracterizados na literatura foram usados como painel de calibração: BPTI (P00974), SFTI-1 (Q4GWU5), SKTI (P01070), Bowman-Birk (P01055), EcTI (P86451, Meriño-Cabrera... — ver Seção 5.1 e referências) e ApTI (P09941+P09942, Meriño-Cabrera et al. 2020). Cinco decoys (mesma composição de aminoácidos, sequência embaralhada — controle negativo padrão) foram gerados por embaralhamento. O painel foi avaliado contra tripsina bovina (receptor real do complexo experimental PDB 1SFI, que também fornece o centro real do sítio ativo a partir da pose de SFTI-1 genuinamente ligada) e contra </w:t>
+      </w:r>
+      <w:r>
+        <w:rPr>
+          <w:i/>
+        </w:rPr>
+        <w:t>S. frugiperda</w:t>
+      </w:r>
+      <w:r>
+        <w:rPr/>
+        <w:t xml:space="preserve"> (alvo primário).</w:t>
+      </w:r>
+    </w:p>
+    <w:p>
+      <w:r>
+        <w:rPr>
+          <w:b/>
+        </w:rPr>
+        <w:t>Vina — incidente e substituição por HADDOCK3.</w:t>
+      </w:r>
+      <w:r>
+        <w:rPr/>
+        <w:t xml:space="preserve"> A tentativa inicial de usar AutoDock Vina (mesma ferramenta e build do V1, f458505-mod) para o docking rígido dos controles resultou em consumo anômalo de 97 GB de RAM (processo terminado por segurança) ao dockar um controle de 58 resíduos — o Vina não é adequado para ligantes do tamanho de uma proteína dobrada inteira. O docking rígido foi refeito com </w:t>
+      </w:r>
+      <w:r>
+        <w:rPr>
+          <w:b/>
+        </w:rPr>
+        <w:t>HADDOCK3</w:t>
+      </w:r>
+      <w:r>
+        <w:rPr/>
+        <w:t xml:space="preserve"> (v2026.7.0), usando restrições ambíguas de interface com resíduos ativos identificados por contato direto (&lt;6 Å) em complexos experimentais reais (1SFI, 1AVX, 1D6R, 4J2Y) — não citações de literatura não conferidas: Lys15/Ala16 (BPTI), Lys5 (SFTI-1), Arg63 (SKTI), Lys16 (Bowman-Birk), Arg64 (EcTI). As 10 corridas (5 controles × 2 receptores) completaram sem incidente (~20 s cada), com scores na direção biologicamente esperada, mas amostra pequena demais (sem decoys neste rung) para declarar go/no-go isolado.</w:t>
+      </w:r>
+    </w:p>
+    <w:p>
+      <w:r>
+        <w:rPr>
+          <w:b/>
+        </w:rPr>
+        <w:t>Boltz-2 — separação real de decoy em 10/10 pares.</w:t>
+      </w:r>
+      <w:r>
+        <w:rPr/>
+        <w:t xml:space="preserve"> Co-dobramento nativo (sem restrição de interface) via Boltz-2, 22 predições reais (6 controles + 5 decoys pareados × 2 receptores + 2 ApTI). </w:t>
+      </w:r>
+      <w:r>
+        <w:rPr>
+          <w:b/>
+        </w:rPr>
+        <w:t xml:space="preserve">Resultado principal: </w:t>
+      </w:r>
+      <w:r>
+        <w:rPr>
+          <w:rFonts w:ascii="Consolas" w:hAnsi="Consolas"/>
+          <w:b/>
+        </w:rPr>
+        <w:t>confidence_score</w:t>
+      </w:r>
+      <w:r>
+        <w:rPr>
+          <w:b/>
+        </w:rPr>
+        <w:t xml:space="preserve"> e pLDDT do complexo separam inibidor real de decoy em 10/10 pares testados</w:t>
+      </w:r>
+      <w:r>
+        <w:rPr/>
+        <w:t xml:space="preserve">, incluindo contra o alvo primário real </w:t>
+      </w:r>
+      <w:r>
+        <w:rPr>
+          <w:i/>
+        </w:rPr>
+        <w:t>S. frugiperda</w:t>
+      </w:r>
+      <w:r>
+        <w:rPr/>
+        <w:t xml:space="preserve"> (não só a referência bovina) — critério de go/no-go do plano satisfeito para essas métricas. </w:t>
+      </w:r>
+      <w:r>
+        <w:rPr>
+          <w:rFonts w:ascii="Consolas" w:hAnsi="Consolas"/>
+        </w:rPr>
+        <w:t>ipTM</w:t>
+      </w:r>
+      <w:r>
+        <w:rPr/>
+        <w:t xml:space="preserve"> isolado foi limítrofe em 1/10 pares (SKTI × </w:t>
+      </w:r>
+      <w:r>
+        <w:rPr>
+          <w:i/>
+        </w:rPr>
+        <w:t>S. frugiperda</w:t>
+      </w:r>
+      <w:r>
+        <w:rPr/>
+        <w:t>, Δ=0,005, dentro do ruído), não devendo ser usado como critério de corte único.</w:t>
+      </w:r>
+    </w:p>
+    <w:p>
+      <w:r>
+        <w:rPr>
+          <w:b/>
+        </w:rPr>
+        <w:t>MD curta (2 ns) — sinal misto, causa raiz identificada.</w:t>
+      </w:r>
+      <w:r>
+        <w:rPr/>
+        <w:t xml:space="preserve"> Complexos preditos pelo Boltz-2 foram usados como estrutura de partida para MD real (GROMACS, AMBER99SB-ILDN, TIP3P, pH real por receptor: 8,0 para tripsina bovina, 10,0 para o intestino alcalino de </w:t>
+      </w:r>
+      <w:r>
+        <w:rPr>
+          <w:i/>
+        </w:rPr>
+        <w:t>S. frugiperda</w:t>
+      </w:r>
+      <w:r>
+        <w:rPr/>
+        <w:t xml:space="preserve">). Ao contrário do Boltz-2, o </w:t>
+      </w:r>
+      <w:r>
+        <w:rPr>
+          <w:b/>
+        </w:rPr>
+        <w:t>RMSD do complexo em 2 ns não separou real de decoy de forma consistente</w:t>
+      </w:r>
+      <w:r>
+        <w:rPr/>
+        <w:t>: direção esperada (real mais estável) em 3/5 pares testados (SKTI, Bowman-Birk, EcTI), empate em 1/5 (BPTI) e direção invertida em 1/5 (SFTI-1, RMSD real 2,4× maior que o decoy). Inspeção do código (</w:t>
+      </w:r>
+      <w:r>
+        <w:rPr>
+          <w:rFonts w:ascii="Consolas" w:hAnsi="Consolas"/>
+        </w:rPr>
+        <w:t>MDAgent._analyze_trajectory</w:t>
+      </w:r>
+      <w:r>
+        <w:rPr/>
+        <w:t xml:space="preserve">) revelou a causa provável: o RMSD é calculado sobre o backbone do complexo inteiro, sem separar cadeias no ajuste — não isola a estabilidade da interface receptor-ligante, o que pode inflar o RMSD de ligantes pequenos (como o SFTI-1, 14 resíduos) por rotação/deslizamento relativo ao receptor maior, mesmo permanecendo ligados. </w:t>
+      </w:r>
+      <w:r>
+        <w:rPr>
+          <w:b/>
+        </w:rPr>
+        <w:t>Limitação herdada do protocolo do V1 (Seção 2.8), não introduzida nesta sessão.</w:t>
+      </w:r>
+      <w:r>
+        <w:rPr/>
+        <w:t xml:space="preserve"> MM-PBSA (energia de ligação real, último degrau da escada) ainda não foi executado até o fechamento desta seção.</w:t>
+      </w:r>
+    </w:p>
+    <w:p>
+      <w:r>
+        <w:rPr>
+          <w:b/>
+        </w:rPr>
+        <w:t>Estado do painel ao fechamento desta subseção (corte 2026-09-18):</w:t>
+      </w:r>
+      <w:r>
+        <w:rPr/>
+        <w:t xml:space="preserve"> Boltz-2 completo (6/6 controles); HADDOCK3 completo para os 5 controles com sítio reativo verificado (sem decoys ainda); MD curta em andamento (12/22 sistemas concluídos); MM-PBSA pendente.</w:t>
+      </w:r>
+    </w:p>
+    <w:p>
+      <w:pPr>
+        <w:pStyle w:val="Heading2"/>
+      </w:pPr>
+      <w:r>
+        <w:t>5.3 Fechamento do B0.5 — MD/MM-PBSA completos e decisão de scorer (2026-09-18/22)</w:t>
+      </w:r>
+    </w:p>
+    <w:p>
+      <w:r>
+        <w:rPr/>
+        <w:t xml:space="preserve">A campanha de MD curta foi concluída nos 22 sistemas do painel de calibração (2 receptores × 6 inibidores reais + 10 decoys pareados), confirmando o padrão observado no corte parcial: RMSD do complexo inteiro em 2 ns separa real de decoy em apenas </w:t>
+      </w:r>
+      <w:r>
+        <w:rPr>
+          <w:b/>
+        </w:rPr>
+        <w:t>5/10 pares</w:t>
+      </w:r>
+      <w:r>
+        <w:rPr/>
+        <w:t xml:space="preserve"> — equivalente a acaso — pela mesma limitação estrutural identificada na Seção 5.2 (backbone ajustado sem isolar a interface). MM-PBSA (GB, trajetória única) foi então executado nos mesmos 22 sistemas, após correção de três bugs de protocolo (grupos de índice, PBC/centralização, seleção de frames — ver </w:t>
+      </w:r>
+      <w:r>
+        <w:rPr>
+          <w:rFonts w:ascii="Consolas" w:hAnsi="Consolas"/>
+        </w:rPr>
+        <w:t>docs/bench/b05_mmpbsa_completo.md</w:t>
+      </w:r>
+      <w:r>
+        <w:rPr/>
+        <w:t xml:space="preserve">): o resultado é </w:t>
+      </w:r>
+      <w:r>
+        <w:rPr>
+          <w:b/>
+        </w:rPr>
+        <w:t>4/10</w:t>
+      </w:r>
+      <w:r>
+        <w:rPr/>
+        <w:t>, pior que acaso como discriminador real-vs-decoy (o decoy "vence" por até +144,8 kcal/mol em 1 par).</w:t>
+      </w:r>
+    </w:p>
+    <w:p>
+      <w:r>
+        <w:rPr>
+          <w:b/>
+        </w:rPr>
+        <w:t>Resultado consolidado da escada de calibração</w:t>
+      </w:r>
+      <w:r>
+        <w:rPr/>
+        <w:t xml:space="preserve"> (</w:t>
+      </w:r>
+      <w:r>
+        <w:rPr>
+          <w:rFonts w:ascii="Consolas" w:hAnsi="Consolas"/>
+        </w:rPr>
+        <w:t>docs/bench/b05_consolidado_final.md</w:t>
+      </w:r>
+      <w:r>
+        <w:rPr/>
+        <w:t xml:space="preserve">, figura+tabela em </w:t>
+      </w:r>
+      <w:r>
+        <w:rPr>
+          <w:rFonts w:ascii="Consolas" w:hAnsi="Consolas"/>
+        </w:rPr>
+        <w:t>outputs/b05_figs/</w:t>
+      </w:r>
+      <w:r>
+        <w:rPr/>
+        <w:t>):</w:t>
+      </w:r>
+    </w:p>
+    <w:p>
+      <w:r>
+        <w:rPr>
+          <w:b/>
+        </w:rPr>
+        <w:t>Tabela 10.</w:t>
+      </w:r>
+      <w:r>
+        <w:rPr/>
+        <w:t xml:space="preserve"> Taxa de separação real-vs-decoy por método na calibração B0.5 (n=10 pares/método).</w:t>
+      </w:r>
+    </w:p>
+    <w:tbl>
+      <w:tblPr>
+        <w:tblStyle w:val="LightGrid-Accent1"/>
+        <w:tblW w:type="auto" w:w="0"/>
+        <w:tblLook w:firstColumn="1" w:firstRow="1" w:lastColumn="0" w:lastRow="0" w:noHBand="0" w:noVBand="1" w:val="04A0"/>
+      </w:tblPr>
+      <w:tblGrid>
+        <w:gridCol w:w="4320"/>
+        <w:gridCol w:w="4320"/>
+      </w:tblGrid>
+      <w:tr>
+        <w:tc>
+          <w:tcPr>
+            <w:tcW w:type="dxa" w:w="4320"/>
+          </w:tcPr>
+          <w:p>
+            <w:r>
+              <w:rPr>
+                <w:b/>
+              </w:rPr>
+              <w:t>Método</w:t>
+            </w:r>
+          </w:p>
+        </w:tc>
+        <w:tc>
+          <w:tcPr>
+            <w:tcW w:type="dxa" w:w="4320"/>
+          </w:tcPr>
+          <w:p>
+            <w:r>
+              <w:rPr>
+                <w:b/>
+              </w:rPr>
+              <w:t>Separação real-vs-decoy (n=10 pares)</w:t>
+            </w:r>
+          </w:p>
+        </w:tc>
+      </w:tr>
+      <w:tr>
+        <w:tc>
+          <w:tcPr>
+            <w:tcW w:type="dxa" w:w="4320"/>
+          </w:tcPr>
+          <w:p>
+            <w:r>
+              <w:rPr/>
+              <w:t>Boltz-2 (</w:t>
+            </w:r>
+            <w:r>
+              <w:rPr>
+                <w:rFonts w:ascii="Consolas" w:hAnsi="Consolas"/>
+              </w:rPr>
+              <w:t>confidence_score</w:t>
+            </w:r>
+            <w:r>
+              <w:rPr/>
+              <w:t>/pLDDT)</w:t>
+            </w:r>
+          </w:p>
+        </w:tc>
+        <w:tc>
+          <w:tcPr>
+            <w:tcW w:type="dxa" w:w="4320"/>
+          </w:tcPr>
+          <w:p>
+            <w:r>
+              <w:rPr>
+                <w:b/>
+              </w:rPr>
+              <w:t>10/10 — único método validado</w:t>
+            </w:r>
+          </w:p>
+        </w:tc>
+      </w:tr>
+      <w:tr>
+        <w:tc>
+          <w:tcPr>
+            <w:tcW w:type="dxa" w:w="4320"/>
+          </w:tcPr>
+          <w:p>
+            <w:r>
+              <w:rPr/>
+              <w:t>RMSD (MD 2 ns, complexo inteiro)</w:t>
+            </w:r>
+          </w:p>
+        </w:tc>
+        <w:tc>
+          <w:tcPr>
+            <w:tcW w:type="dxa" w:w="4320"/>
+          </w:tcPr>
+          <w:p>
+            <w:r>
+              <w:rPr/>
+              <w:t>5/10 — equivalente a acaso</w:t>
+            </w:r>
+          </w:p>
+        </w:tc>
+      </w:tr>
+      <w:tr>
+        <w:tc>
+          <w:tcPr>
+            <w:tcW w:type="dxa" w:w="4320"/>
+          </w:tcPr>
+          <w:p>
+            <w:r>
+              <w:rPr/>
+              <w:t>MM-PBSA (GB, trajetória única)</w:t>
+            </w:r>
+          </w:p>
+        </w:tc>
+        <w:tc>
+          <w:tcPr>
+            <w:tcW w:type="dxa" w:w="4320"/>
+          </w:tcPr>
+          <w:p>
+            <w:r>
+              <w:rPr/>
+              <w:t>4/10 — pior que acaso</w:t>
+            </w:r>
+          </w:p>
+        </w:tc>
+      </w:tr>
+    </w:tbl>
+    <w:p>
+      <w:r>
+        <w:rPr>
+          <w:b/>
+        </w:rPr>
+        <w:t>Decisão registrada (usuário, 2026-09-18):</w:t>
+      </w:r>
+      <w:r>
+        <w:rPr/>
+        <w:t xml:space="preserve"> o loop de contrasseleção B2.7 usa </w:t>
+      </w:r>
+      <w:r>
+        <w:rPr>
+          <w:b/>
+        </w:rPr>
+        <w:t>apenas Boltz-2</w:t>
+      </w:r>
+      <w:r>
+        <w:rPr/>
+        <w:t xml:space="preserve"> como scorer da margem de seletividade (</w:t>
+      </w:r>
+      <w:r>
+        <w:rPr>
+          <w:rFonts w:ascii="Consolas" w:hAnsi="Consolas"/>
+        </w:rPr>
+        <w:t>margem = score_alvo − max(score_painel_negativo) − penalidades</w:t>
+      </w:r>
+      <w:r>
+        <w:rPr/>
+        <w:t xml:space="preserve">), já refletida em </w:t>
+      </w:r>
+      <w:r>
+        <w:rPr>
+          <w:rFonts w:ascii="Consolas" w:hAnsi="Consolas"/>
+        </w:rPr>
+        <w:t>docs/PLANO_V2_GENERATIVO.md</w:t>
+      </w:r>
+      <w:r>
+        <w:rPr/>
+        <w:t xml:space="preserve"> §B2.7 (commit </w:t>
+      </w:r>
+      <w:r>
+        <w:rPr>
+          <w:rFonts w:ascii="Consolas" w:hAnsi="Consolas"/>
+        </w:rPr>
+        <w:t>425db5a</w:t>
+      </w:r>
+      <w:r>
+        <w:rPr/>
+        <w:t xml:space="preserve">). RMSD e MM-PBSA de trajetória única permanecem descartados como critério de </w:t>
+      </w:r>
+      <w:r>
+        <w:rPr>
+          <w:i/>
+        </w:rPr>
+        <w:t>go/no-go</w:t>
+      </w:r>
+      <w:r>
+        <w:rPr/>
+        <w:t xml:space="preserve"> — pendência sinalizada e ainda não resolvida: os critérios de sucesso S1/S3 do plano original ainda listam ΔG MM-PBSA e RMSD/ocupância (n=3 réplicas) como validação </w:t>
+      </w:r>
+      <w:r>
+        <w:rPr>
+          <w:i/>
+        </w:rPr>
+        <w:t>final</w:t>
+      </w:r>
+      <w:r>
+        <w:rPr/>
+        <w:t>, e precisam de revisão à luz deste resultado antes de serem reaplicados.</w:t>
+      </w:r>
+    </w:p>
+    <w:p>
+      <w:r>
+        <w:rPr/>
+        <w:t xml:space="preserve">Com B0.5 fechado, o próprio plano define o caminho crítico seguinte: </w:t>
+      </w:r>
+      <w:r>
+        <w:rPr>
+          <w:b/>
+        </w:rPr>
+        <w:t>B1.4</w:t>
+      </w:r>
+      <w:r>
+        <w:rPr/>
+        <w:t xml:space="preserve"> (geometria real do bolso S1, hoje ainda heurística) → </w:t>
+      </w:r>
+      <w:r>
+        <w:rPr>
+          <w:b/>
+        </w:rPr>
+        <w:t>B1.2</w:t>
+      </w:r>
+      <w:r>
+        <w:rPr/>
+        <w:t xml:space="preserve"> (painel negativo completo) → </w:t>
+      </w:r>
+      <w:r>
+        <w:rPr>
+          <w:b/>
+        </w:rPr>
+        <w:t>B1.5</w:t>
+      </w:r>
+      <w:r>
+        <w:rPr/>
+        <w:t xml:space="preserve"> (determinantes de seletividade) — todos bloqueando qualquer geração generativa (RFdiffusion) contra o painel novo de 7 alvos (Seção 5.1), sob risco de repetir o mecanismo que já produziu o resultado 0/23 da Seção 4 (bolso S1 tratado como conservado entre espécies, hotspot heurístico incorreto).</w:t>
+      </w:r>
+    </w:p>
+    <w:p>
+      <w:r>
+        <w:rPr/>
+        <w:t>A Figura 5 (</w:t>
+      </w:r>
+      <w:r>
+        <w:rPr>
+          <w:rFonts w:ascii="Consolas" w:hAnsi="Consolas"/>
+        </w:rPr>
+        <w:t>outputs/figuras_artigo/fig5_especificidade_SI.png</w:t>
+      </w:r>
+      <w:r>
+        <w:rPr/>
+        <w:t xml:space="preserve">, commit </w:t>
+      </w:r>
+      <w:r>
+        <w:rPr>
+          <w:rFonts w:ascii="Consolas" w:hAnsi="Consolas"/>
+        </w:rPr>
+        <w:t>d8cad3e</w:t>
+      </w:r>
+      <w:r>
+        <w:rPr/>
+        <w:t xml:space="preserve">) amplia o achado de especificidade da Seção 4 para um universo maior de candidatos testados (n=35, SI vs. tripsina humana × </w:t>
+      </w:r>
+      <w:r>
+        <w:rPr>
+          <w:i/>
+        </w:rPr>
+        <w:t>A. mellifera</w:t>
+      </w:r>
+      <w:r>
+        <w:rPr/>
+        <w:t xml:space="preserve">): </w:t>
+      </w:r>
+      <w:r>
+        <w:rPr>
+          <w:b/>
+        </w:rPr>
+        <w:t>0/35 aprovados</w:t>
+      </w:r>
+      <w:r>
+        <w:rPr/>
+        <w:t xml:space="preserve"> (SI ≥ 2,0 kcal/mol em ambos os não-alvos), com vários candidatos em SI negativo (ligam-se de fato melhor ao não-alvo que ao alvo-primário). Consistente com o 0/21-23 já reportado na Seção 4 sobre um subconjunto menor.</w:t>
+      </w:r>
+    </w:p>
+    <w:p>
+      <w:pPr>
+        <w:pStyle w:val="Heading2"/>
+      </w:pPr>
+      <w:r>
+        <w:t>5.4 B1.4 — Mapeamento real dos subsítios S1-S4/S1'-S3' e exossítio (2026-09-23)</w:t>
+      </w:r>
+    </w:p>
+    <w:p>
+      <w:r>
+        <w:rPr/>
+        <w:t>A heurística de geometria usada até aqui (</w:t>
+      </w:r>
+      <w:r>
+        <w:rPr>
+          <w:rFonts w:ascii="Consolas" w:hAnsi="Consolas"/>
+        </w:rPr>
+        <w:t>structure_agent.py::_find_catalytic_triad</w:t>
+      </w:r>
+      <w:r>
+        <w:rPr/>
+        <w:t>, critério "HIS-ASP-SER ≤15 Å") tem um offset sistemático de +15/+16 resíduos confirmado em 8/9 espécies do painel — não é um bug isolado, como se pensava antes. Para substituí-la, os subsítios reais foram redefinidos a partir de dois complexos cristalográficos de referência do RCSB (2PTC, tripsina bovina–BPTI; 1SFI, tripsina bovina–SFTI-1): o resíduo P1 de cada inibidor foi identificado por geometria real (resíduo cujo carbono carbonila fica mais próximo do OG de uma Ser da própria tripsina — não citado de literatura sem verificação), e os subsítios S4–S1'–S3' mais o exossítio foram definidos por contato físico real (≤4,5 Å) entre os sete resíduos do inibidor em torno da ligação cindível (P4...P3', nomenclatura Schechter-Berger) e a tripsina. Em ambos os complexos a Ser catalítica identificada foi Ser195 (numeração bovina clássica) e o S1 real incluiu Asp189/Gly216/Gly226/Ser190/Ser214/Trp215 — bolso de especificidade canônico, obtido aqui por geometria pura, não citação.</w:t>
+      </w:r>
+    </w:p>
+    <w:p>
+      <w:r>
+        <w:rPr/>
+        <w:t xml:space="preserve">A transferência dessa definição para os 9 receptores do painel usou equivalência estrutural real via </w:t>
+      </w:r>
+      <w:r>
+        <w:rPr>
+          <w:b/>
+        </w:rPr>
+        <w:t>foldseek TMalign</w:t>
+      </w:r>
+      <w:r>
+        <w:rPr/>
+        <w:t xml:space="preserve"> (</w:t>
+      </w:r>
+      <w:r>
+        <w:rPr>
+          <w:rFonts w:ascii="Consolas" w:hAnsi="Consolas"/>
+        </w:rPr>
+        <w:t>--alignment-type 1</w:t>
+      </w:r>
+      <w:r>
+        <w:rPr/>
+        <w:t xml:space="preserve">), não offset de sequência assumido. Resultado: </w:t>
+      </w:r>
+      <w:r>
+        <w:rPr>
+          <w:b/>
+        </w:rPr>
+        <w:t>18/18 combinações espécie×template aprovadas</w:t>
+      </w:r>
+      <w:r>
+        <w:rPr/>
+        <w:t xml:space="preserve"> (TMscore 0,946–0,957, RMSD 1,18–1,41 Å, 100% dos resíduos de subsítio transferidos), nenhum receptor excluído do painel. Validação cruzada forte: a posição Asp189-equivalente encontrada por este método bate </w:t>
+      </w:r>
+      <w:r>
+        <w:rPr>
+          <w:b/>
+        </w:rPr>
+        <w:t>exatamente</w:t>
+      </w:r>
+      <w:r>
+        <w:rPr/>
+        <w:t xml:space="preserve"> (9/9 espécies) com a encontrada independentemente por offset de sequência (Seção 5.1) — dois métodos totalmente diferentes convergindo no mesmo resultado. Saída completa em </w:t>
+      </w:r>
+      <w:r>
+        <w:rPr>
+          <w:rFonts w:ascii="Consolas" w:hAnsi="Consolas"/>
+        </w:rPr>
+        <w:t>data-lepidoptera-panel/subsites_by_receptor.json</w:t>
+      </w:r>
+      <w:r>
+        <w:rPr/>
+        <w:t xml:space="preserve"> (script: </w:t>
+      </w:r>
+      <w:r>
+        <w:rPr>
+          <w:rFonts w:ascii="Consolas" w:hAnsi="Consolas"/>
+        </w:rPr>
+        <w:t>scripts/map_subsites_b14.py</w:t>
+      </w:r>
+      <w:r>
+        <w:rPr/>
+        <w:t xml:space="preserve">, documentação: </w:t>
+      </w:r>
+      <w:r>
+        <w:rPr>
+          <w:rFonts w:ascii="Consolas" w:hAnsi="Consolas"/>
+        </w:rPr>
+        <w:t>docs/bench/b14_subsites_reais.md</w:t>
+      </w:r>
+      <w:r>
+        <w:rPr/>
+        <w:t>).</w:t>
+      </w:r>
+    </w:p>
+    <w:p>
+      <w:pPr>
+        <w:pStyle w:val="Heading2"/>
+      </w:pPr>
+      <w:r>
+        <w:t>5.5 Pivô: geração por difusão sem contrasseleção (2026-09-23, em andamento)</w:t>
+      </w:r>
+    </w:p>
+    <w:p>
+      <w:r>
+        <w:rPr/>
+        <w:t xml:space="preserve">O usuário decidiu pausar temporariamente a linha de contrasseleção (B1.2 painel negativo e B1.5 determinantes de seletividade, Seção 5.3) e redirecionar o projeto para </w:t>
+      </w:r>
+      <w:r>
+        <w:rPr>
+          <w:b/>
+        </w:rPr>
+        <w:t>descobrir os melhores peptídeos contra Lepidoptera em geral</w:t>
+      </w:r>
+      <w:r>
+        <w:rPr/>
+        <w:t xml:space="preserve"> — potência ampla contra o painel de 7 pragas-alvo, sem objetivo de seletividade nesta fase. B1.2/B1.5 ficam arquivados para retomada futura em separado; isso não contradiz a prioridade permanente de especificidade do projeto, apenas reorganiza o trabalho em módulos.</w:t>
+      </w:r>
+    </w:p>
+    <w:p>
+      <w:r>
+        <w:rPr/>
+        <w:t xml:space="preserve">Escolhida a </w:t>
+      </w:r>
+      <w:r>
+        <w:rPr>
+          <w:b/>
+        </w:rPr>
+        <w:t>Trilha A</w:t>
+      </w:r>
+      <w:r>
+        <w:rPr/>
+        <w:t xml:space="preserve"> (macrociclo via RFdiffusion cíclico, </w:t>
+      </w:r>
+      <w:r>
+        <w:rPr>
+          <w:rFonts w:ascii="Consolas" w:hAnsi="Consolas"/>
+        </w:rPr>
+        <w:t>inference.cyclic=True</w:t>
+      </w:r>
+      <w:r>
+        <w:rPr/>
+        <w:t xml:space="preserve">, validado geometricamente na Seção anterior/B0.2 — fechamento N-C real de 1,24 Å), ancorada nos hotspots reais de B1.4 (resíduos de contato S1+S2). Um piloto técnico (2 designs, </w:t>
+      </w:r>
+      <w:r>
+        <w:rPr>
+          <w:i/>
+        </w:rPr>
+        <w:t>S. frugiperda</w:t>
+      </w:r>
+      <w:r>
+        <w:rPr/>
+        <w:t xml:space="preserve">) confirmou o pipeline de ponta a ponta: macrociclo real (N-C = 1,26–1,31 Å) e redesenho de sequência via ProteinMPNN funcionando em código de produção — revelando e corrigindo dois bugs reais no processo (QC medindo a cadeia errada do complexo receptor-peptídeo; ProteinMPNN falhando silenciosamente quando </w:t>
+      </w:r>
+      <w:r>
+        <w:rPr>
+          <w:rFonts w:ascii="Consolas" w:hAnsi="Consolas"/>
+        </w:rPr>
+        <w:t>batch_size</w:t>
+      </w:r>
+      <w:r>
+        <w:rPr/>
+        <w:t xml:space="preserve"> excede </w:t>
+      </w:r>
+      <w:r>
+        <w:rPr>
+          <w:rFonts w:ascii="Consolas" w:hAnsi="Consolas"/>
+        </w:rPr>
+        <w:t>num_seq_per_target</w:t>
+      </w:r>
+      <w:r>
+        <w:rPr/>
+        <w:t>).</w:t>
+      </w:r>
+    </w:p>
+    <w:p>
+      <w:r>
+        <w:rPr/>
+        <w:t>Uma campanha real foi então lançada contra os 7 alvos primários do painel (comprimentos 8–16 aa, 10 macrociclos por comprimento/espécie, 30 sequências ProteinMPNN por macrociclo — 350 backbones no total), em execução no servidor no momento do fechamento desta seção (</w:t>
+      </w:r>
+      <w:r>
+        <w:rPr>
+          <w:rFonts w:ascii="Consolas" w:hAnsi="Consolas"/>
+        </w:rPr>
+        <w:t>scripts/run_diffusion_campaign.py --species all7</w:t>
+      </w:r>
+      <w:r>
+        <w:rPr/>
+        <w:t>). Resultados finais e triagem por Boltz-2 (único scorer validado na calibração da Seção 5.2/5.3) ficam para a próxima atualização deste documento.</w:t>
       </w:r>
     </w:p>
     <w:p>

</xml_diff>